<commit_message>
Deploying to gh-pages from @ UCD-SERG/qwt@f8b2a55f9e72274afee365723afdbc58be1eeb22 🚀
</commit_message>
<xml_diff>
--- a/chapters/chapter1.docx
+++ b/chapters/chapter1.docx
@@ -537,7 +537,7 @@
         <w:t xml:space="preserve"> </w:t>
       </w:r>
       <w:r>
-        <w:t xml:space="preserve">338df91</w:t>
+        <w:t xml:space="preserve">f8b2a55</w:t>
       </w:r>
     </w:p>
     <w:p>
@@ -559,7 +559,7 @@
         <w:t xml:space="preserve"> </w:t>
       </w:r>
       <w:r>
-        <w:t xml:space="preserve">338df91bce0760a4d2482260b2b11f40a78b1e43</w:t>
+        <w:t xml:space="preserve">f8b2a55f9e72274afee365723afdbc58be1eeb22</w:t>
       </w:r>
     </w:p>
     <w:p>
@@ -581,7 +581,7 @@
         <w:t xml:space="preserve"> </w:t>
       </w:r>
       <w:r>
-        <w:t xml:space="preserve">2026-04-06 17:54:09 -0700</w:t>
+        <w:t xml:space="preserve">2026-04-06 18:12:52 -0700</w:t>
       </w:r>
     </w:p>
     <w:p>

</xml_diff>

<commit_message>
Deploying to gh-pages from @ UCD-SERG/qwt@1b36df4cc327dc8d4e585b791fa31ba602f5de58 🚀
</commit_message>
<xml_diff>
--- a/chapters/chapter1.docx
+++ b/chapters/chapter1.docx
@@ -537,7 +537,7 @@
         <w:t xml:space="preserve"> </w:t>
       </w:r>
       <w:r>
-        <w:t xml:space="preserve">f8b2a55</w:t>
+        <w:t xml:space="preserve">1b36df4</w:t>
       </w:r>
     </w:p>
     <w:p>
@@ -559,7 +559,7 @@
         <w:t xml:space="preserve"> </w:t>
       </w:r>
       <w:r>
-        <w:t xml:space="preserve">f8b2a55f9e72274afee365723afdbc58be1eeb22</w:t>
+        <w:t xml:space="preserve">1b36df4cc327dc8d4e585b791fa31ba602f5de58</w:t>
       </w:r>
     </w:p>
     <w:p>
@@ -581,7 +581,7 @@
         <w:t xml:space="preserve"> </w:t>
       </w:r>
       <w:r>
-        <w:t xml:space="preserve">2026-04-06 18:12:52 -0700</w:t>
+        <w:t xml:space="preserve">2026-04-08 14:25:47 -0700</w:t>
       </w:r>
     </w:p>
     <w:p>

</xml_diff>

<commit_message>
Deploying to gh-pages from @ UCD-SERG/qwt@5484a92114e182356a941b147243bf97cde637d8 🚀
</commit_message>
<xml_diff>
--- a/chapters/chapter1.docx
+++ b/chapters/chapter1.docx
@@ -537,7 +537,7 @@
         <w:t xml:space="preserve"> </w:t>
       </w:r>
       <w:r>
-        <w:t xml:space="preserve">1b36df4</w:t>
+        <w:t xml:space="preserve">5484a92</w:t>
       </w:r>
     </w:p>
     <w:p>
@@ -559,7 +559,7 @@
         <w:t xml:space="preserve"> </w:t>
       </w:r>
       <w:r>
-        <w:t xml:space="preserve">1b36df4cc327dc8d4e585b791fa31ba602f5de58</w:t>
+        <w:t xml:space="preserve">5484a92114e182356a941b147243bf97cde637d8</w:t>
       </w:r>
     </w:p>
     <w:p>
@@ -581,7 +581,7 @@
         <w:t xml:space="preserve"> </w:t>
       </w:r>
       <w:r>
-        <w:t xml:space="preserve">2026-04-08 14:25:47 -0700</w:t>
+        <w:t xml:space="preserve">2026-04-10 01:33:19 -0700</w:t>
       </w:r>
     </w:p>
     <w:p>

</xml_diff>

<commit_message>
Deploying to gh-pages from @ UCD-SERG/qwt@a4a16a1b90ef6871292da271515a00c7a17a69f8 🚀
</commit_message>
<xml_diff>
--- a/chapters/chapter1.docx
+++ b/chapters/chapter1.docx
@@ -10,13 +10,21 @@
         <w:t xml:space="preserve">Chapter 1: Introduction</w:t>
       </w:r>
     </w:p>
-    <w:bookmarkStart w:id="16" w:name="chapter-1-introduction"/>
+    <w:p>
+      <w:pPr>
+        <w:pStyle w:val="FirstParagraph"/>
+      </w:pPr>
+      <w:r>
+        <w:t xml:space="preserve">This is the first chapter of your website. Replace this content with your own.</w:t>
+      </w:r>
+    </w:p>
+    <w:bookmarkStart w:id="11" w:name="section-1.1"/>
     <w:p>
       <w:pPr>
         <w:pStyle w:val="Heading1"/>
       </w:pPr>
       <w:r>
-        <w:t xml:space="preserve">1. Chapter 1: Introduction</w:t>
+        <w:t xml:space="preserve">1. Section 1.1</w:t>
       </w:r>
     </w:p>
     <w:p>
@@ -24,33 +32,16 @@
         <w:pStyle w:val="FirstParagraph"/>
       </w:pPr>
       <w:r>
-        <w:t xml:space="preserve">This is the first chapter of your website. Replace this content with your own.</w:t>
-      </w:r>
-    </w:p>
-    <w:bookmarkStart w:id="11" w:name="section-1.1"/>
+        <w:t xml:space="preserve">Add your content here.</w:t>
+      </w:r>
+    </w:p>
+    <w:bookmarkStart w:id="10" w:name="subsection-1.1.1"/>
     <w:p>
       <w:pPr>
         <w:pStyle w:val="Heading2"/>
       </w:pPr>
       <w:r>
-        <w:t xml:space="preserve">1.1 Section 1.1</w:t>
-      </w:r>
-    </w:p>
-    <w:p>
-      <w:pPr>
-        <w:pStyle w:val="FirstParagraph"/>
-      </w:pPr>
-      <w:r>
-        <w:t xml:space="preserve">Add your content here.</w:t>
-      </w:r>
-    </w:p>
-    <w:bookmarkStart w:id="10" w:name="subsection-1.1.1"/>
-    <w:p>
-      <w:pPr>
-        <w:pStyle w:val="Heading3"/>
-      </w:pPr>
-      <w:r>
-        <w:t xml:space="preserve">1.1.1 Subsection 1.1.1</w:t>
+        <w:t xml:space="preserve">1.1 Subsection 1.1.1</w:t>
       </w:r>
     </w:p>
     <w:p>
@@ -164,10 +155,10 @@
     <w:bookmarkStart w:id="12" w:name="section-1.2"/>
     <w:p>
       <w:pPr>
-        <w:pStyle w:val="Heading2"/>
-      </w:pPr>
-      <w:r>
-        <w:t xml:space="preserve">1.2 Section 1.2</w:t>
+        <w:pStyle w:val="Heading1"/>
+      </w:pPr>
+      <w:r>
+        <w:t xml:space="preserve">2. Section 1.2</w:t>
       </w:r>
     </w:p>
     <w:p>
@@ -395,10 +386,10 @@
     <w:bookmarkStart w:id="13" w:name="section-1.3"/>
     <w:p>
       <w:pPr>
-        <w:pStyle w:val="Heading2"/>
-      </w:pPr>
-      <w:r>
-        <w:t xml:space="preserve">1.3 Section 1.3</w:t>
+        <w:pStyle w:val="Heading1"/>
+      </w:pPr>
+      <w:r>
+        <w:t xml:space="preserve">3. Section 1.3</w:t>
       </w:r>
     </w:p>
     <w:p>
@@ -495,7 +486,7 @@
     <w:bookmarkStart w:id="15" w:name="references"/>
     <w:p>
       <w:pPr>
-        <w:pStyle w:val="Heading2"/>
+        <w:pStyle w:val="Heading1"/>
       </w:pPr>
       <w:r>
         <w:t xml:space="preserve">References</w:t>
@@ -504,7 +495,6 @@
     <w:bookmarkStart w:id="14" w:name="refs"/>
     <w:bookmarkEnd w:id="14"/>
     <w:bookmarkEnd w:id="15"/>
-    <w:bookmarkEnd w:id="16"/>
     <w:sectPr>
       <w:footnotePr>
         <w:numRestart w:val="eachSect"/>

</xml_diff>